<commit_message>
Use 'Dra. Lizbeth Verdugo' sitewide
Update the doctor's displayed name across the project: replace 'Lizbeth Yamilet Hernández Verdugo' / 'Lizbeth Hernández' with 'Lizbeth Verdugo' in content, data, components, pages, SEO metadata, image alt text and generated docs. Files updated include data.json, src/data/*, src/app/*, components, and documentation outputs (.md/.html/.docx). Content-only changes; no behavioral or API changes.
</commit_message>
<xml_diff>
--- a/Dra_Lizbeth_Verdugo_Contenido.docx
+++ b/Dra_Lizbeth_Verdugo_Contenido.docx
@@ -56,7 +56,7 @@
           <w:color w:val="572D55"/>
           <w:sz w:val="32"/>
         </w:rPr>
-        <w:t>Dra. Lizbeth Yamilet Hernández Verdugo</w:t>
+        <w:t>Dra. Lizbeth Verdugo</w:t>
         <w:br/>
       </w:r>
       <w:r>
@@ -88,7 +88,7 @@
           <w:color w:val="7D7D7D"/>
           <w:sz w:val="20"/>
         </w:rPr>
-        <w:t>México, D.F.  |  01 de July de 2026</w:t>
+        <w:t>México, D.F.  |  28 de September de 2026</w:t>
       </w:r>
     </w:p>
     <w:p>
@@ -123,7 +123,7 @@
           <w:color w:val="333333"/>
           <w:sz w:val="22"/>
         </w:rPr>
-        <w:t>Soy la Dra. Lizbeth Yamilet Hernández Verdugo, médica especialista en Pediatría con subespecialidad en Hematología Pediátrica y formación de alta especialidad en Medicina Transfusional. Mi práctica profesional se enfoca en el diagnóstico, tratamiento y seguimiento integral de niños y adolescentes con enfermedades hematológicas, trastornos de la coagulación y alteraciones plaquetarias (altas y bajas), incluyendo anemias, leucemias, hemofilia y otros padecimientos de la sangre. Mi compromiso es brindar una atención médica cálida, ética y altamente especializada, orientada al bienestar de mis pacientes y la tranquilidad de sus familias.</w:t>
+        <w:t>Soy la Dra. Lizbeth Verdugo, médica especialista en Pediatría con subespecialidad en Hematología Pediátrica y formación de alta especialidad en Medicina Transfusional. Mi práctica profesional se enfoca en el diagnóstico, tratamiento y seguimiento integral de niños y adolescentes con enfermedades hematológicas, trastornos de la coagulación y alteraciones plaquetarias (altas y bajas), incluyendo anemias, leucemias, hemofilia y otros padecimientos de la sangre. Mi compromiso es brindar una atención médica cálida, ética y altamente especializada, orientada al bienestar de mis pacientes y la tranquilidad de sus familias.</w:t>
       </w:r>
     </w:p>
     <w:p>
@@ -735,7 +735,7 @@
                 <w:rFonts w:ascii="Calibri" w:hAnsi="Calibri"/>
                 <w:color w:val="333333"/>
               </w:rPr>
-              <w:t>En trámite</w:t>
+              <w:t>2609152002A00439</w:t>
             </w:r>
           </w:p>
         </w:tc>
@@ -4142,7 +4142,7 @@
           <w:color w:val="333333"/>
           <w:sz w:val="22"/>
         </w:rPr>
-        <w:t xml:space="preserve"> La interpretación de resultados de laboratorio consiste en el análisis especializado e integral de estudios como biometría hemática, perfil de hierro, pruebas de coagulación, frotis de sangre periférica y otros análisis complementarios. La Dra. Lizbeth Hernández correlaciona estos resultados con la historia clínica y la exploración física del paciente para identificar alteraciones hematológicas, orientar el diagnóstico y definir los estudios o tratamientos más adecuados.</w:t>
+        <w:t xml:space="preserve"> La interpretación de resultados de laboratorio consiste en el análisis especializado e integral de estudios como biometría hemática, perfil de hierro, pruebas de coagulación, frotis de sangre periférica y otros análisis complementarios. La Dra. Lizbeth Verdugo correlaciona estos resultados con la historia clínica y la exploración física del paciente para identificar alteraciones hematológicas, orientar el diagnóstico y definir los estudios o tratamientos más adecuados.</w:t>
       </w:r>
     </w:p>
     <w:p>
@@ -6558,7 +6558,7 @@
               <w:t>Hallazgos incidentales en laboratorio.</w:t>
               <w:br/>
               <w:br/>
-              <w:t>La Dra. Lizbeth Hernández evalúa alteraciones en estudios de laboratorio, biometrías hemáticas y pruebas especializadas para identificar la causa y orientar el tratamiento más adecuado para cada paciente.</w:t>
+              <w:t>La Dra. Lizbeth Verdugo evalúa alteraciones en estudios de laboratorio, biometrías hemáticas y pruebas especializadas para identificar la causa y orientar el tratamiento más adecuado para cada paciente.</w:t>
             </w:r>
           </w:p>
         </w:tc>
@@ -19150,7 +19150,7 @@
           <w:color w:val="333333"/>
           <w:sz w:val="22"/>
         </w:rPr>
-        <w:t>La Dra. Lizbeth Hernández evalúa alteraciones en estudios de laboratorio, biometrías hemáticas y pruebas especializadas para identificar la causa y orientar el tratamiento más adecuado para cada paciente.</w:t>
+        <w:t>La Dra. Lizbeth Verdugo evalúa biometrías hemáticas, estudios especializados y pruebas de laboratorio para identificar la causa de alteraciones en sangre en niños.</w:t>
       </w:r>
     </w:p>
     <w:p>
@@ -23518,7 +23518,7 @@
           <w:color w:val="333333"/>
           <w:sz w:val="22"/>
         </w:rPr>
-        <w:t>Con fundamento en los artículos 15 y 16 de la Ley Federal de Protección de Datos Personales en Posesión de Particulares hacemos de su conocimiento que la Dra. Lizbeth Yamilet Hernández Verdugo, con domicilio en Calle San Luis Potosí #143, Interior 207, entre Calle Tonalá y Calle Jalapa, Colonia Roma Norte, C.P. 06700, Delegación Cuauhtémoc, Ciudad de México es responsable de recabar sus datos personales, del uso que se le dé a los mismos y de su protección.</w:t>
+        <w:t>Con fundamento en los artículos 15 y 16 de la Ley Federal de Protección de Datos Personales en Posesión de Particulares hacemos de su conocimiento que la Dra. Lizbeth Verdugo, con domicilio en Calle San Luis Potosí #143, Interior 207, entre Calle Tonalá y Calle Jalapa, Colonia Roma Norte, C.P. 06700, Delegación Cuauhtémoc, Ciudad de México es responsable de recabar sus datos personales, del uso que se le dé a los mismos y de su protección.</w:t>
       </w:r>
     </w:p>
     <w:p>
@@ -23730,7 +23730,7 @@
                 <w:rFonts w:ascii="Calibri" w:hAnsi="Calibri"/>
                 <w:color w:val="333333"/>
               </w:rPr>
-              <w:t>Dra. Lizbeth Yamilet Hernández Verdugo</w:t>
+              <w:t>Dra. Lizbeth Verdugo</w:t>
             </w:r>
           </w:p>
         </w:tc>
@@ -24166,7 +24166,7 @@
         <w:color w:val="787878"/>
         <w:sz w:val="18"/>
       </w:rPr>
-      <w:t>Dra. Lizbeth Yamilet Hernández Verdugo  |  Contenido del Sitio Web</w:t>
+      <w:t>Dra. Lizbeth Verdugo  |  Contenido del Sitio Web</w:t>
     </w:r>
   </w:p>
 </w:ftr>

</xml_diff>